<commit_message>
Fix search, signup and guidance from user feedback
</commit_message>
<xml_diff>
--- a/docs/INTERNAL_DESIGN.docx
+++ b/docs/INTERNAL_DESIGN.docx
@@ -11,8 +11,16 @@
       </w:r>
     </w:p>
     <w:p>
+      <w:commentRangeStart w:id="0"/>
       <w:r>
-        <w:t>版数：第1.0版　更新日：2026年10月15日</w:t>
+        <w:t>版数：第1.1版　更新日：2026年10月15日</w:t>
+      </w:r>
+      <w:commentRangeEnd w:id="0"/>
+      <w:r>
+        <w:rPr>
+          <w:rStyle w:val="CommentReference"/>
+        </w:rPr>
+        <w:commentReference w:id="0"/>
       </w:r>
     </w:p>
     <w:p>
@@ -37,8 +45,16 @@
       </w:r>
     </w:p>
     <w:p>
+      <w:commentRangeStart w:id="1"/>
       <w:r>
-        <w:t>要件定義書 第1.4版の実装を開発チームが把握し、保守と発表の根拠に使えるようにする。対象はcom.example.demo配下、テンプレート、静的資産、dataのSQL、JSON設定。外部AIを使った推薦、準備中の案内ページの本機能、飲酒投稿の操作画面は完成済みとして扱わない。</w:t>
+        <w:t>要件定義書 第1.5版の実装を開発チームが把握し、保守と発表の根拠に使えるようにする。対象はcom.example.demo配下、テンプレート、静的資産、dataのSQL、JSON設定。外部AIを使った推薦、準備中の案内ページの本機能、飲酒投稿の操作画面は完成済みとして扱わない。</w:t>
+      </w:r>
+      <w:commentRangeEnd w:id="1"/>
+      <w:r>
+        <w:rPr>
+          <w:rStyle w:val="CommentReference"/>
+        </w:rPr>
+        <w:commentReference w:id="1"/>
       </w:r>
     </w:p>
     <w:p>
@@ -3413,8 +3429,16 @@
       </w:r>
     </w:p>
     <w:p>
+      <w:commentRangeStart w:id="2"/>
       <w:r>
-        <w:t>匿名の診断はDBに保存しない。会員の診断ではセッションと回答を作成し、今回集計したタグの嗜好スコアを上書きする。今回登場しない過去のタグは残る。今回の推薦は保存済み嗜好ではなく、送信された回答を集計したMapを入力にする。</w:t>
+        <w:t>匿名の診断はDBに保存しない。会員の診断ではセッションと回答を作成し、今回集計したタグの嗜好スコアを上書きする。今回登場しない過去のタグは残る。今回の推薦は保存済み嗜好ではなく、送信された回答を集計したMapを入力にする。保存方法は変更せず、診断前・結果・マイページで過去タグが残ることを説明する。匿名の結果には非保存と表示する。</w:t>
+      </w:r>
+      <w:commentRangeEnd w:id="2"/>
+      <w:r>
+        <w:rPr>
+          <w:rStyle w:val="CommentReference"/>
+        </w:rPr>
+        <w:commentReference w:id="2"/>
       </w:r>
     </w:p>
     <w:p>
@@ -3423,8 +3447,16 @@
       </w:r>
     </w:p>
     <w:p>
+      <w:commentRangeStart w:id="3"/>
       <w:r>
-        <w:t>drink_posts、drink_post_likes、drink_post_reportsにはEntity・Repositoryがある。PostModerationServiceも存在するが、現行Controllerと画面に投稿・いいね・通報の操作経路はない。診断履歴は保存されるが、マイページは現在の嗜好スコアとお気に入りを表示し、診断履歴一覧を提供していない。</w:t>
+        <w:t>drink_posts、drink_post_likes、drink_post_reportsにはEntity・Repositoryがある。PostModerationServiceも存在するが、現行Controllerと画面に投稿・いいね・通報の操作経路はない。診断履歴は保存されるが、マイページはこれまでに保存された嗜好スコアとお気に入りを表示し、診断履歴一覧を提供していない。</w:t>
+      </w:r>
+      <w:commentRangeEnd w:id="3"/>
+      <w:r>
+        <w:rPr>
+          <w:rStyle w:val="CommentReference"/>
+        </w:rPr>
+        <w:commentReference w:id="3"/>
       </w:r>
     </w:p>
     <w:p>
@@ -3584,7 +3616,7 @@
               <w:rPr>
                 <w:sz w:val="18"/>
               </w:rPr>
-              <w:t>診断・検索、3トピック、ガイド導線、ランダム1件と類似メジャー1件</w:t>
+              <w:t>診断・検索、3トピック、NEWS（お知らせがない場合は空表示）、ガイド導線、ランダム1件と類似メジャー1件</w:t>
             </w:r>
           </w:p>
         </w:tc>
@@ -3710,11 +3742,19 @@
             <w:pPr>
               <w:spacing w:after="0" w:before="0" w:line="276" w:lineRule="auto"/>
             </w:pPr>
+            <w:commentRangeStart w:id="4"/>
             <w:r>
               <w:rPr>
                 <w:sz w:val="18"/>
               </w:rPr>
-              <w:t>複合検索、並べ替え、6件のページング</w:t>
+              <w:t>現在の検索条件の表示・保持、条件解除、6件のページング</w:t>
+            </w:r>
+            <w:commentRangeEnd w:id="4"/>
+            <w:r>
+              <w:rPr>
+                <w:rStyle w:val="CommentReference"/>
+              </w:rPr>
+              <w:commentReference w:id="4"/>
             </w:r>
           </w:p>
         </w:tc>
@@ -3775,11 +3815,19 @@
             <w:pPr>
               <w:spacing w:after="0" w:before="0" w:line="276" w:lineRule="auto"/>
             </w:pPr>
+            <w:commentRangeStart w:id="5"/>
             <w:r>
               <w:rPr>
                 <w:sz w:val="18"/>
               </w:rPr>
-              <w:t>紹介、タグ、購入先、公開レビュー、本人の評価とお気に入り</w:t>
+              <w:t>基本情報と容量別価格、紹介、タグ、購入先、レビューとお気に入り</w:t>
+            </w:r>
+            <w:commentRangeEnd w:id="5"/>
+            <w:r>
+              <w:rPr>
+                <w:rStyle w:val="CommentReference"/>
+              </w:rPr>
+              <w:commentReference w:id="5"/>
             </w:r>
           </w:p>
         </w:tc>
@@ -3902,11 +3950,19 @@
             <w:pPr>
               <w:spacing w:after="0" w:before="0" w:line="276" w:lineRule="auto"/>
             </w:pPr>
+            <w:commentRangeStart w:id="6"/>
             <w:r>
               <w:rPr>
                 <w:sz w:val="18"/>
               </w:rPr>
-              <w:t>傾向、回答説明、最大5件のおすすめと共通タグ</w:t>
+              <w:t>今回の傾向・回答説明・最大5件のおすすめ、保存方法の説明</w:t>
+            </w:r>
+            <w:commentRangeEnd w:id="6"/>
+            <w:r>
+              <w:rPr>
+                <w:rStyle w:val="CommentReference"/>
+              </w:rPr>
+              <w:commentReference w:id="6"/>
             </w:r>
           </w:p>
         </w:tc>
@@ -4032,11 +4088,19 @@
             <w:pPr>
               <w:spacing w:after="0" w:before="0" w:line="276" w:lineRule="auto"/>
             </w:pPr>
+            <w:commentRangeStart w:id="7"/>
             <w:r>
               <w:rPr>
                 <w:sz w:val="18"/>
               </w:rPr>
-              <w:t>嗜好スコア、お気に入り、プロフィール概要</w:t>
+              <w:t>保存された嗜好と過去タグ保持の説明、お気に入り、プロフィール</w:t>
+            </w:r>
+            <w:commentRangeEnd w:id="7"/>
+            <w:r>
+              <w:rPr>
+                <w:rStyle w:val="CommentReference"/>
+              </w:rPr>
+              <w:commentReference w:id="7"/>
             </w:r>
           </w:p>
         </w:tc>
@@ -4227,11 +4291,89 @@
             <w:pPr>
               <w:spacing w:after="0" w:before="0" w:line="276" w:lineRule="auto"/>
             </w:pPr>
+            <w:commentRangeStart w:id="8"/>
             <w:r>
               <w:rPr>
                 <w:sz w:val="18"/>
               </w:rPr>
-              <w:t>各準備中ページの共通表示</w:t>
+              <w:t>各準備中ページの共通表示とメニューの準備中ラベル</w:t>
+            </w:r>
+            <w:commentRangeEnd w:id="8"/>
+            <w:r>
+              <w:rPr>
+                <w:rStyle w:val="CommentReference"/>
+              </w:rPr>
+              <w:commentReference w:id="8"/>
+            </w:r>
+          </w:p>
+        </w:tc>
+      </w:tr>
+      <w:tr>
+        <w:trPr>
+          <w:cantSplit/>
+        </w:trPr>
+        <w:tc>
+          <w:tcPr>
+            <w:tcW w:type="dxa" w:w="2835"/>
+            <w:vAlign w:val="center"/>
+            <w:tcMar>
+              <w:top w:w="90" w:type="dxa"/>
+              <w:bottom w:w="90" w:type="dxa"/>
+              <w:left w:w="110" w:type="dxa"/>
+              <w:right w:w="110" w:type="dxa"/>
+            </w:tcMar>
+            <w:tcBorders>
+              <w:top w:val="single" w:sz="4" w:color="D9D9D9"/>
+              <w:bottom w:val="single" w:sz="4" w:color="D9D9D9"/>
+              <w:left w:val="single" w:sz="4" w:color="D9D9D9"/>
+              <w:right w:val="single" w:sz="4" w:color="D9D9D9"/>
+            </w:tcBorders>
+            <w:shd w:fill="F5F5F5"/>
+          </w:tcPr>
+          <w:p>
+            <w:pPr>
+              <w:spacing w:after="0" w:before="0" w:line="276" w:lineRule="auto"/>
+            </w:pPr>
+            <w:r>
+              <w:rPr>
+                <w:sz w:val="18"/>
+              </w:rPr>
+              <w:t>プライバシー privacy.html</w:t>
+            </w:r>
+          </w:p>
+        </w:tc>
+        <w:tc>
+          <w:tcPr>
+            <w:tcW w:type="dxa" w:w="6803"/>
+            <w:vAlign w:val="center"/>
+            <w:tcMar>
+              <w:top w:w="90" w:type="dxa"/>
+              <w:bottom w:w="90" w:type="dxa"/>
+              <w:left w:w="110" w:type="dxa"/>
+              <w:right w:w="110" w:type="dxa"/>
+            </w:tcMar>
+            <w:tcBorders>
+              <w:top w:val="single" w:sz="4" w:color="D9D9D9"/>
+              <w:bottom w:val="single" w:sz="4" w:color="D9D9D9"/>
+              <w:left w:val="single" w:sz="4" w:color="D9D9D9"/>
+              <w:right w:val="single" w:sz="4" w:color="D9D9D9"/>
+            </w:tcBorders>
+            <w:shd w:fill="F5F5F5"/>
+          </w:tcPr>
+          <w:p>
+            <w:pPr>
+              <w:spacing w:after="0" w:before="0" w:line="276" w:lineRule="auto"/>
+            </w:pPr>
+            <w:r>
+              <w:rPr>
+                <w:sz w:val="18"/>
+              </w:rPr>
+              <w:t>登録前にも読める情報の利用目的と公開範囲</w:t>
+            </w:r>
+            <w:r>
+              <w:rPr>
+                <w:rStyle w:val="CommentReference"/>
+              </w:rPr>
             </w:r>
           </w:p>
         </w:tc>
@@ -4251,8 +4393,20 @@
       </w:r>
     </w:p>
     <w:p>
+      <w:commentRangeStart w:id="9"/>
       <w:r>
-        <w:t>site-headerの検索、横スクロールナビ、標準dialogのその他メニューを全画面で使う。初心者ガイドはホームと共通メニューから開き、商品詳細からbuy・store・openへ直接進める。ガイドは通常のアンカーリンクで、JSなしでも読める。</w:t>
+        <w:t>site-headerの検索、横スクロールナビ、標準dialogのその他メニューを全画面で使う。メニューは枠・文字のない2本線とし、マウスホバーで非モーダル表示する。ボタンからメニューへ移動中は180msの猶予を設け、外へ移動すると閉じる。タッチ・クリック・Enter・下矢印でも開き、閉じるボタン・Escape・外側クリックで閉じる。キーボードで閉じるとボタンへフォーカスを戻す。ナビ上部の罫線とヘッダー・メニュー・ホームカードの装飾影は表示しない。ホームのTOPICSとNEWSの見出しはゴシック体とし、NEWSの内容がない場合は「現在、お知らせはありません。」を表示する。初心者ガイドはホームと共通メニューから開き、商品詳細からbuy・store・openへ直接進める。ガイドは通常のアンカーリンクで、JSなしでも読める。</w:t>
+      </w:r>
+      <w:commentRangeEnd w:id="9"/>
+      <w:r>
+        <w:rPr>
+          <w:rStyle w:val="CommentReference"/>
+        </w:rPr>
+      </w:r>
+    </w:p>
+    <w:p>
+      <w:r>
+        <w:t>スマートフォン用の非表示・ドロップダウン指定は.site-header .main-navに限定する。検索のページ送りは全幅で表示して必要に応じ折り返し、現在ページにaria-currentを付ける。設定画面のマイページに戻るリンクも全幅で表示する。</w:t>
       </w:r>
     </w:p>
     <w:p>
@@ -4282,8 +4436,20 @@
       </w:r>
     </w:p>
     <w:p>
+      <w:commentRangeStart w:id="10"/>
       <w:r>
-        <w:t>SakeCatalogService.searchは条件の空白と#タグ入力を整え、RepositoryのPageをSakePageDtoへ変換する。ページ番号は0始まり、負の指定は0、範囲超過は最終ページ。SakePageDtoは独自recordでありPageインターフェースの実装ではない。Repositoryでは実際のSpring Data Pageを使用する。</w:t>
+        <w:t>SakeCatalogService.searchは条件の空白と#タグ入力を整え、RepositoryのPageをSakePageDtoへ変換する。ページ番号は0始まり、負の指定は0、範囲超過は最終ページ。SakePageDtoは独自recordでありPageインターフェースの実装ではない。Repositoryでは実際のSpring Data Pageを使用する。search.htmlのキーワード入力を含む検索欄に現在値を戻し、条件の再送信・並べ替え・価格帯追加で維持する。すべての条件を解除するリンクも設ける。価格帯は参考価格と表示し、検索・価格帯・価格順にはDBの価格を使う。</w:t>
+      </w:r>
+      <w:commentRangeEnd w:id="10"/>
+      <w:r>
+        <w:rPr>
+          <w:rStyle w:val="CommentReference"/>
+        </w:rPr>
+      </w:r>
+    </w:p>
+    <w:p>
+      <w:r>
+        <w:t>詳細の基本情報はmodel.Sakeの酒種・産地・度数を使う。度数が0以下なら未確認とし、登録された参考値である旨を付記する。SakePage.pricesに容量別の税込価格があれば表示し、容量または金額が空なら未確認と表示する。pricesが空ならDBの参考価格を対象容量未確認として表示する。価格の変動や一覧との相違、購入前の公式情報確認を案内する。今回の変更ではDB値やスキーマを変更しない。</w:t>
       </w:r>
     </w:p>
     <w:p>
@@ -4295,13 +4461,29 @@
       </w:r>
     </w:p>
     <w:p>
+      <w:commentRangeStart w:id="11"/>
       <w:r>
-        <w:t>AuthControllerは入力検証・email重複確認・BCrypt保存後にSecurityContextをHTTPセッションに保存し、診断へ移動する。ログインはSecurityConfigとCustomUserDetailsServiceで処理する。仮パスワード使用中は変更案内付きマイページ、管理者は管理トップ、一般会員はホームへ移動する。現行の会員登録にはメール認証・再送機能を含めない。</w:t>
+        <w:t>AuthControllerは入力検証・email重複確認・BCrypt保存後にSecurityContextをHTTPセッションに保存し、診断へ移動する。ログインはSecurityConfigとCustomUserDetailsServiceで処理する。仮パスワード使用中は変更案内付きマイページ、管理者は管理トップ、一般会員はホームへ移動する。現行の会員登録にはメール認証・再送機能を含めない。SignupFormの@Size・@Utf8ByteLengthと共通Utf8InputLengthで、ハッシュ化前に8文字以上・UTF-8で72バイト以内を検証する。上限超過時は登録画面をHTTP 200で再表示し、入力欄に理由を示す。</w:t>
+      </w:r>
+      <w:commentRangeEnd w:id="11"/>
+      <w:r>
+        <w:rPr>
+          <w:rStyle w:val="CommentReference"/>
+        </w:rPr>
+        <w:commentReference w:id="11"/>
       </w:r>
     </w:p>
     <w:p>
+      <w:commentRangeStart w:id="12"/>
       <w:r>
-        <w:t>MyPageControllerは更新対象のuser_idをログイン情報から取得する。プロフィールと画像、パスワード、退会を扱う。パスワード変更と退会では現在のパスワードを照合する。画像はJPEG・PNG・GIFで最大20MBを受信し、900KBを超える場合にJPEGへ圧縮する。保存画像は900KB以下、初期長辺1600px以下を目標にし、位置と拡大率を別フィールドに保存する。</w:t>
+        <w:t>MyPageControllerは更新対象のuser_idをログイン情報から取得する。プロフィールと画像、パスワード、退会を扱う。パスワード変更と退会では現在のパスワードを照合する。変更するパスワードにも同じUtf8InputLengthの72バイト検証を使い、入力不正は設定画面に説明する。画像はJPEG・PNG・GIFで最大20MBを受信し、900KBを超える場合にJPEGへ圧縮する。保存画像は900KB以下、初期長辺1600px以下を目標にし、位置と拡大率を別フィールドに保存する。</w:t>
+      </w:r>
+      <w:commentRangeEnd w:id="12"/>
+      <w:r>
+        <w:rPr>
+          <w:rStyle w:val="CommentReference"/>
+        </w:rPr>
+        <w:commentReference w:id="12"/>
       </w:r>
     </w:p>
     <w:p>
@@ -7636,11 +7818,19 @@
             <w:pPr>
               <w:spacing w:after="0" w:before="0" w:line="276" w:lineRule="auto"/>
             </w:pPr>
+            <w:commentRangeStart w:id="13"/>
             <w:r>
               <w:rPr>
                 <w:sz w:val="18"/>
               </w:rPr>
-              <w:t>/about、/privacy、/external-transmission</w:t>
+              <w:t>/about、/external-transmission</w:t>
+            </w:r>
+            <w:commentRangeEnd w:id="13"/>
+            <w:r>
+              <w:rPr>
+                <w:rStyle w:val="CommentReference"/>
+              </w:rPr>
+              <w:commentReference w:id="13"/>
             </w:r>
           </w:p>
         </w:tc>
@@ -7671,6 +7861,106 @@
                 <w:sz w:val="18"/>
               </w:rPr>
               <w:t>公開、準備中の案内</w:t>
+            </w:r>
+          </w:p>
+        </w:tc>
+      </w:tr>
+      <w:tr>
+        <w:trPr>
+          <w:cantSplit/>
+        </w:trPr>
+        <w:tc>
+          <w:tcPr>
+            <w:tcW w:type="dxa" w:w="1417"/>
+            <w:vAlign w:val="center"/>
+            <w:tcMar>
+              <w:top w:w="90" w:type="dxa"/>
+              <w:bottom w:w="90" w:type="dxa"/>
+              <w:left w:w="110" w:type="dxa"/>
+              <w:right w:w="110" w:type="dxa"/>
+            </w:tcMar>
+            <w:tcBorders>
+              <w:top w:val="single" w:sz="4" w:color="D9D9D9"/>
+              <w:bottom w:val="single" w:sz="4" w:color="D9D9D9"/>
+              <w:left w:val="single" w:sz="4" w:color="D9D9D9"/>
+              <w:right w:val="single" w:sz="4" w:color="D9D9D9"/>
+            </w:tcBorders>
+            <w:shd w:fill="FFFFFF"/>
+          </w:tcPr>
+          <w:p>
+            <w:pPr>
+              <w:spacing w:after="0" w:before="0" w:line="276" w:lineRule="auto"/>
+            </w:pPr>
+            <w:r>
+              <w:rPr>
+                <w:sz w:val="18"/>
+              </w:rPr>
+              <w:t>GET</w:t>
+            </w:r>
+          </w:p>
+        </w:tc>
+        <w:tc>
+          <w:tcPr>
+            <w:tcW w:type="dxa" w:w="4025"/>
+            <w:vAlign w:val="center"/>
+            <w:tcMar>
+              <w:top w:w="90" w:type="dxa"/>
+              <w:bottom w:w="90" w:type="dxa"/>
+              <w:left w:w="110" w:type="dxa"/>
+              <w:right w:w="110" w:type="dxa"/>
+            </w:tcMar>
+            <w:tcBorders>
+              <w:top w:val="single" w:sz="4" w:color="D9D9D9"/>
+              <w:bottom w:val="single" w:sz="4" w:color="D9D9D9"/>
+              <w:left w:val="single" w:sz="4" w:color="D9D9D9"/>
+              <w:right w:val="single" w:sz="4" w:color="D9D9D9"/>
+            </w:tcBorders>
+            <w:shd w:fill="FFFFFF"/>
+          </w:tcPr>
+          <w:p>
+            <w:pPr>
+              <w:spacing w:after="0" w:before="0" w:line="276" w:lineRule="auto"/>
+            </w:pPr>
+            <w:r>
+              <w:rPr>
+                <w:sz w:val="18"/>
+              </w:rPr>
+              <w:t>/privacy</w:t>
+            </w:r>
+            <w:r>
+              <w:rPr>
+                <w:rStyle w:val="CommentReference"/>
+              </w:rPr>
+            </w:r>
+          </w:p>
+        </w:tc>
+        <w:tc>
+          <w:tcPr>
+            <w:tcW w:type="dxa" w:w="4195"/>
+            <w:vAlign w:val="center"/>
+            <w:tcMar>
+              <w:top w:w="90" w:type="dxa"/>
+              <w:bottom w:w="90" w:type="dxa"/>
+              <w:left w:w="110" w:type="dxa"/>
+              <w:right w:w="110" w:type="dxa"/>
+            </w:tcMar>
+            <w:tcBorders>
+              <w:top w:val="single" w:sz="4" w:color="D9D9D9"/>
+              <w:bottom w:val="single" w:sz="4" w:color="D9D9D9"/>
+              <w:left w:val="single" w:sz="4" w:color="D9D9D9"/>
+              <w:right w:val="single" w:sz="4" w:color="D9D9D9"/>
+            </w:tcBorders>
+            <w:shd w:fill="FFFFFF"/>
+          </w:tcPr>
+          <w:p>
+            <w:pPr>
+              <w:spacing w:after="0" w:before="0" w:line="276" w:lineRule="auto"/>
+            </w:pPr>
+            <w:r>
+              <w:rPr>
+                <w:sz w:val="18"/>
+              </w:rPr>
+              <w:t>公開、現行機能の情報利用と公開範囲の説明</w:t>
             </w:r>
           </w:p>
         </w:tc>
@@ -7767,7 +8057,7 @@
     <w:p>
       <w:pPr>
         <w:pStyle w:val="Heading2"/>
-        <w:pageBreakBefore/>
+        <w:pageBreakBefore w:val="0"/>
       </w:pPr>
       <w:r>
         <w:t>8 2 検証と未提供の機能</w:t>
@@ -7782,8 +8072,23 @@
       </w:r>
     </w:p>
     <w:p>
+      <w:commentRangeStart w:id="14"/>
+      <w:commentRangeStart w:id="15"/>
       <w:r>
-        <w:t>残課題は準備中ページ、飲酒投稿・いいね・通報の操作経路、診断履歴一覧、トピック初期表示のランダム化、商品情報の精査、SMTPと公開環境の運用確認。全カタログを読む推薦・比較は現行規模向けで、件数増加時は取得件数・キャッシュ・索引を検討する。今回はこれらの未提供機能を追加したと記載しない。</w:t>
+        <w:t>残課題は準備中ページ、プライバシーポリシーの運用情報（連絡先・保存期間・委託先）の確認、飲酒投稿・いいね・通報の操作経路、診断履歴一覧、トピック初期表示のランダム化、参考価格・度数等のデモ商品情報の精査、SMTPと公開環境の運用確認。全カタログを読む推薦・比較は現行規模向けで、件数増加時は取得件数・キャッシュ・索引を検討する。今回はこれらの未提供機能を追加したと記載しない。</w:t>
+      </w:r>
+      <w:commentRangeEnd w:id="15"/>
+      <w:r>
+        <w:rPr>
+          <w:rStyle w:val="CommentReference"/>
+        </w:rPr>
+        <w:commentReference w:id="15"/>
+      </w:r>
+      <w:commentRangeEnd w:id="14"/>
+      <w:r>
+        <w:rPr>
+          <w:rStyle w:val="CommentReference"/>
+        </w:rPr>
       </w:r>
     </w:p>
     <w:p>
@@ -7800,6 +8105,267 @@
     </w:sectPr>
   </w:body>
 </w:document>
+</file>
+
+<file path=word/comments.xml><?xml version="1.0" encoding="utf-8"?>
+<w:comments xmlns:a="http://schemas.openxmlformats.org/drawingml/2006/main" xmlns:pic="http://schemas.openxmlformats.org/drawingml/2006/picture" xmlns:r="http://schemas.openxmlformats.org/officeDocument/2006/relationships" xmlns:w="http://schemas.openxmlformats.org/wordprocessingml/2006/main" xmlns:wp="http://schemas.openxmlformats.org/drawingml/2006/wordprocessingDrawing" xmlns:mc="http://schemas.openxmlformats.org/markup-compatibility/2006" xmlns:a14="http://schemas.microsoft.com/office/drawing/2010/main" xmlns:w14="http://schemas.microsoft.com/office/word/2010/wordml" xmlns:wpc="http://schemas.microsoft.com/office/word/2010/wordprocessingCanvas">
+  <w:comment w:id="0" w:author="NewBooze" w:initials="NB" w:date="2026-10-15T05:26:51Z">
+    <w:p>
+      <w:pPr>
+        <w:pStyle w:val="CommentText"/>
+      </w:pPr>
+      <w:r>
+        <w:rPr>
+          <w:rStyle w:val="CommentReference"/>
+        </w:rPr>
+        <w:annotationRef/>
+      </w:r>
+      <w:r>
+        <w:t>2026年10月15日の利用者フィードバック対応に合わせ、現行の表示・入力検証・保存仕様を反映。</w:t>
+      </w:r>
+    </w:p>
+  </w:comment>
+  <w:comment w:id="1" w:author="NewBooze" w:initials="NB" w:date="2026-10-15T05:26:51Z">
+    <w:p>
+      <w:pPr>
+        <w:pStyle w:val="CommentText"/>
+      </w:pPr>
+      <w:r>
+        <w:rPr>
+          <w:rStyle w:val="CommentReference"/>
+        </w:rPr>
+        <w:annotationRef/>
+      </w:r>
+      <w:r>
+        <w:t>2026年10月15日の利用者フィードバック対応に合わせ、現行の表示・入力検証・保存仕様を反映。</w:t>
+      </w:r>
+    </w:p>
+  </w:comment>
+  <w:comment w:id="2" w:author="NewBooze" w:initials="NB" w:date="2026-10-15T05:26:51Z">
+    <w:p>
+      <w:pPr>
+        <w:pStyle w:val="CommentText"/>
+      </w:pPr>
+      <w:r>
+        <w:rPr>
+          <w:rStyle w:val="CommentReference"/>
+        </w:rPr>
+        <w:annotationRef/>
+      </w:r>
+      <w:r>
+        <w:t>2026年10月15日の利用者フィードバック対応に合わせ、現行の表示・入力検証・保存仕様を反映。</w:t>
+      </w:r>
+    </w:p>
+  </w:comment>
+  <w:comment w:id="3" w:author="NewBooze" w:initials="NB" w:date="2026-10-15T05:26:51Z">
+    <w:p>
+      <w:pPr>
+        <w:pStyle w:val="CommentText"/>
+      </w:pPr>
+      <w:r>
+        <w:rPr>
+          <w:rStyle w:val="CommentReference"/>
+        </w:rPr>
+        <w:annotationRef/>
+      </w:r>
+      <w:r>
+        <w:t>2026年10月15日の利用者フィードバック対応に合わせ、現行の表示・入力検証・保存仕様を反映。</w:t>
+      </w:r>
+    </w:p>
+  </w:comment>
+  <w:comment w:id="4" w:author="NewBooze" w:initials="NB" w:date="2026-10-15T05:26:51Z">
+    <w:p>
+      <w:pPr>
+        <w:pStyle w:val="CommentText"/>
+      </w:pPr>
+      <w:r>
+        <w:rPr>
+          <w:rStyle w:val="CommentReference"/>
+        </w:rPr>
+        <w:annotationRef/>
+      </w:r>
+      <w:r>
+        <w:t>2026年10月15日の利用者フィードバック対応に合わせ、現行の表示・入力検証・保存仕様を反映。</w:t>
+      </w:r>
+    </w:p>
+  </w:comment>
+  <w:comment w:id="5" w:author="NewBooze" w:initials="NB" w:date="2026-10-15T05:26:51Z">
+    <w:p>
+      <w:pPr>
+        <w:pStyle w:val="CommentText"/>
+      </w:pPr>
+      <w:r>
+        <w:rPr>
+          <w:rStyle w:val="CommentReference"/>
+        </w:rPr>
+        <w:annotationRef/>
+      </w:r>
+      <w:r>
+        <w:t>2026年10月15日の利用者フィードバック対応に合わせ、現行の表示・入力検証・保存仕様を反映。</w:t>
+      </w:r>
+    </w:p>
+  </w:comment>
+  <w:comment w:id="6" w:author="NewBooze" w:initials="NB" w:date="2026-10-15T05:26:51Z">
+    <w:p>
+      <w:pPr>
+        <w:pStyle w:val="CommentText"/>
+      </w:pPr>
+      <w:r>
+        <w:rPr>
+          <w:rStyle w:val="CommentReference"/>
+        </w:rPr>
+        <w:annotationRef/>
+      </w:r>
+      <w:r>
+        <w:t>2026年10月15日の利用者フィードバック対応に合わせ、現行の表示・入力検証・保存仕様を反映。</w:t>
+      </w:r>
+    </w:p>
+  </w:comment>
+  <w:comment w:id="7" w:author="NewBooze" w:initials="NB" w:date="2026-10-15T05:26:51Z">
+    <w:p>
+      <w:pPr>
+        <w:pStyle w:val="CommentText"/>
+      </w:pPr>
+      <w:r>
+        <w:rPr>
+          <w:rStyle w:val="CommentReference"/>
+        </w:rPr>
+        <w:annotationRef/>
+      </w:r>
+      <w:r>
+        <w:t>2026年10月15日の利用者フィードバック対応に合わせ、現行の表示・入力検証・保存仕様を反映。</w:t>
+      </w:r>
+    </w:p>
+  </w:comment>
+  <w:comment w:id="8" w:author="NewBooze" w:initials="NB" w:date="2026-10-15T05:26:51Z">
+    <w:p>
+      <w:pPr>
+        <w:pStyle w:val="CommentText"/>
+      </w:pPr>
+      <w:r>
+        <w:rPr>
+          <w:rStyle w:val="CommentReference"/>
+        </w:rPr>
+        <w:annotationRef/>
+      </w:r>
+      <w:r>
+        <w:t>2026年10月15日の利用者フィードバック対応に合わせ、現行の表示・入力検証・保存仕様を反映。</w:t>
+      </w:r>
+    </w:p>
+  </w:comment>
+  <w:comment w:id="9" w:author="NewBooze" w:initials="NB" w:date="2026-10-15T05:26:51Z">
+    <w:p>
+      <w:pPr>
+        <w:pStyle w:val="CommentText"/>
+      </w:pPr>
+      <w:r>
+        <w:rPr>
+          <w:rStyle w:val="CommentReference"/>
+        </w:rPr>
+        <w:annotationRef/>
+      </w:r>
+      <w:r>
+        <w:t>2026年10月15日の利用者フィードバック対応に合わせ、現行の表示・入力検証・保存仕様を反映。</w:t>
+      </w:r>
+    </w:p>
+  </w:comment>
+  <w:comment w:id="10" w:author="NewBooze" w:initials="NB" w:date="2026-10-15T05:26:51Z">
+    <w:p>
+      <w:pPr>
+        <w:pStyle w:val="CommentText"/>
+      </w:pPr>
+      <w:r>
+        <w:rPr>
+          <w:rStyle w:val="CommentReference"/>
+        </w:rPr>
+        <w:annotationRef/>
+      </w:r>
+      <w:r>
+        <w:t>2026年10月15日の利用者フィードバック対応に合わせ、現行の表示・入力検証・保存仕様を反映。</w:t>
+      </w:r>
+    </w:p>
+  </w:comment>
+  <w:comment w:id="11" w:author="NewBooze" w:initials="NB" w:date="2026-10-15T05:26:51Z">
+    <w:p>
+      <w:pPr>
+        <w:pStyle w:val="CommentText"/>
+      </w:pPr>
+      <w:r>
+        <w:rPr>
+          <w:rStyle w:val="CommentReference"/>
+        </w:rPr>
+        <w:annotationRef/>
+      </w:r>
+      <w:r>
+        <w:t>2026年10月15日の利用者フィードバック対応に合わせ、現行の表示・入力検証・保存仕様を反映。</w:t>
+      </w:r>
+    </w:p>
+  </w:comment>
+  <w:comment w:id="12" w:author="NewBooze" w:initials="NB" w:date="2026-10-15T05:26:51Z">
+    <w:p>
+      <w:pPr>
+        <w:pStyle w:val="CommentText"/>
+      </w:pPr>
+      <w:r>
+        <w:rPr>
+          <w:rStyle w:val="CommentReference"/>
+        </w:rPr>
+        <w:annotationRef/>
+      </w:r>
+      <w:r>
+        <w:t>2026年10月15日の利用者フィードバック対応に合わせ、現行の表示・入力検証・保存仕様を反映。</w:t>
+      </w:r>
+    </w:p>
+  </w:comment>
+  <w:comment w:id="13" w:author="NewBooze" w:initials="NB" w:date="2026-10-15T05:26:51Z">
+    <w:p>
+      <w:pPr>
+        <w:pStyle w:val="CommentText"/>
+      </w:pPr>
+      <w:r>
+        <w:rPr>
+          <w:rStyle w:val="CommentReference"/>
+        </w:rPr>
+        <w:annotationRef/>
+      </w:r>
+      <w:r>
+        <w:t>2026年10月15日の利用者フィードバック対応に合わせ、現行の表示・入力検証・保存仕様を反映。</w:t>
+      </w:r>
+    </w:p>
+  </w:comment>
+  <w:comment w:id="14" w:author="NewBooze" w:initials="NB" w:date="2026-10-15T05:26:51Z">
+    <w:p>
+      <w:pPr>
+        <w:pStyle w:val="CommentText"/>
+      </w:pPr>
+      <w:r>
+        <w:rPr>
+          <w:rStyle w:val="CommentReference"/>
+        </w:rPr>
+        <w:annotationRef/>
+      </w:r>
+      <w:r>
+        <w:t>2026年10月15日の利用者フィードバック対応に合わせ、現行の表示・入力検証・保存仕様を反映。</w:t>
+      </w:r>
+    </w:p>
+  </w:comment>
+  <w:comment w:id="15" w:author="NewBooze" w:initials="NB" w:date="2026-10-15T05:26:51Z">
+    <w:p>
+      <w:pPr>
+        <w:pStyle w:val="CommentText"/>
+      </w:pPr>
+      <w:r>
+        <w:rPr>
+          <w:rStyle w:val="CommentReference"/>
+        </w:rPr>
+        <w:annotationRef/>
+      </w:r>
+      <w:r>
+        <w:t>2026年10月15日の利用者フィードバック対応に合わせ、現行の表示・入力検証・保存仕様を反映。</w:t>
+      </w:r>
+    </w:p>
+  </w:comment>
+</w:comments>
 </file>
 
 <file path=word/footer1.xml><?xml version="1.0" encoding="utf-8"?>

</xml_diff>

<commit_message>
Improve verification email resend flow and verify Gmail delivery
</commit_message>
<xml_diff>
--- a/docs/INTERNAL_DESIGN.docx
+++ b/docs/INTERNAL_DESIGN.docx
@@ -13,7 +13,7 @@
     <w:p>
       <w:commentRangeStart w:id="0"/>
       <w:r>
-        <w:t>版数：第1.2版　更新日：2026年10月19日</w:t>
+        <w:t>版数：第1.3版　更新日：2026年10月21日</w:t>
       </w:r>
       <w:commentRangeEnd w:id="0"/>
       <w:r>
@@ -4480,7 +4480,14 @@
       <w:pPr/>
       <w:pPr/>
       <w:r>
-        <w:t>POST /verify-email/resendは行ロック下で未認証かつ前回送信から60秒以上経過した場合だけ送る。新規トークンへの置換で旧リンクを無効にする。送信失敗は更新をロールバックし、未登録・認証済み・間隔未満にも同じ案内を返す。リンクは受信したHostヘッダーに依存させず、固定設定app.base-urlから構築する。</w:t>
+        <w:t>POST /verify-email/resendは前後の空白を除いたemailの形式と255文字の上限を検証し、未入力は入力エラーを案内する。255文字以内の入力値と結果を一度限りのFlash属性で保持し、URLには含めない。すべての再送POST後はGET /verify-emailへ移動する（PRG）。ページ更新では再送しない。</w:t>
+      </w:r>
+    </w:p>
+    <w:p>
+      <w:pPr/>
+      <w:pPr/>
+      <w:r>
+        <w:t>Serviceは行ロック下で未認証かつ前回送信から60秒以上経過した場合だけ送る。未登録・認証済み・間隔未満・送信成功には同じ条件付きの受付案内を表示し、送信例外は共通のメールエラーを案内する。再送成功時だけトークンの置換が確定して旧リンクが無効になり、失敗時はハッシュ・期限・送信日時を戻す。リンクは受信したHostヘッダーに依存させず、固定設定app.base-urlから構築する。</w:t>
       </w:r>
     </w:p>
     <w:p>
@@ -5897,7 +5904,7 @@
               <w:rPr>
                 <w:sz w:val="18"/>
               </w:rPr>
-              <w:t>未認証会員の再送、60秒間隔</w:t>
+              <w:t>再送受付、60秒間隔、GETへ移動</w:t>
             </w:r>
           </w:p>
         </w:tc>

</xml_diff>

<commit_message>
Prepare public information pages and verify catalog publication data
</commit_message>
<xml_diff>
--- a/docs/INTERNAL_DESIGN.docx
+++ b/docs/INTERNAL_DESIGN.docx
@@ -12,7 +12,7 @@
     </w:p>
     <w:p>
       <w:r>
-        <w:t>版数：第1.4版　更新日：2026年10月21日</w:t>
+        <w:t>版数：第1.5版　更新日：2026年10月21日</w:t>
       </w:r>
     </w:p>
     <w:p>
@@ -38,7 +38,7 @@
     </w:p>
     <w:p>
       <w:r>
-        <w:t>要件定義書 第1.7版の実装を開発チームが把握し、保守と発表の根拠に使えるようにする。対象はcom.example.demo配下、テンプレート、静的資産、dataのSQL、JSON設定。外部AIを使った推薦、準備中の案内ページの本機能、飲酒投稿の操作画面は完成済みとして扱わない。</w:t>
+        <w:t>要件定義書 第1.8版の実装を開発チームが把握し、保守と発表の根拠に使えるようにする。対象はcom.example.demo配下、テンプレート、静的資産、dataのSQL、JSON設定。外部AIを使った推薦、準備中の案内ページの本機能、飲酒投稿の操作画面は完成済みとして扱わない。</w:t>
       </w:r>
     </w:p>
     <w:p>
@@ -1033,7 +1033,7 @@
           </w:tcPr>
           <w:p>
             <w:r>
-              <w:t>SakeCatalog、SakeDiscovery、SakePage、SakeInteraction、会員登録・メール認証、PasswordReset等のService</w:t>
+              <w:t>SakeCatalog、SakeDiscovery、SakePage、SakeInteraction、ProductImagePublication、会員登録・メール認証、PasswordReset等のService</w:t>
             </w:r>
           </w:p>
         </w:tc>
@@ -1458,7 +1458,7 @@
           </w:tcPr>
           <w:p>
             <w:r>
-              <w:t>SecurityConfig、AdminAccountInitializer</w:t>
+              <w:t>SecurityConfig、AdminAccountInitializer、PublicationInformation</w:t>
             </w:r>
           </w:p>
         </w:tc>
@@ -4332,13 +4332,60 @@
             <w:shd w:fill="F5F5F5"/>
           </w:tcPr>
           <w:p>
-            <w:pPr>
-              <w:spacing w:after="0" w:before="0" w:line="276" w:lineRule="auto"/>
-            </w:pPr>
             <w:r>
-              <w:rPr>
-                <w:sz w:val="18"/>
-              </w:rPr>
+              <w:t>公開案内 about.html、contact.html、external-transmission.html</w:t>
+            </w:r>
+          </w:p>
+        </w:tc>
+        <w:tc>
+          <w:tcPr>
+            <w:tcW w:type="dxa" w:w="6803"/>
+            <w:vAlign w:val="center"/>
+            <w:tcMar>
+              <w:top w:w="90" w:type="dxa"/>
+              <w:bottom w:w="90" w:type="dxa"/>
+              <w:left w:w="110" w:type="dxa"/>
+              <w:right w:w="110" w:type="dxa"/>
+            </w:tcMar>
+            <w:tcBorders>
+              <w:top w:val="single" w:sz="4" w:color="D9D9D9"/>
+              <w:bottom w:val="single" w:sz="4" w:color="D9D9D9"/>
+              <w:left w:val="single" w:sz="4" w:color="D9D9D9"/>
+              <w:right w:val="single" w:sz="4" w:color="D9D9D9"/>
+            </w:tcBorders>
+            <w:shd w:fill="F5F5F5"/>
+          </w:tcPr>
+          <w:p>
+            <w:r>
+              <w:t>研究と終了予定、運営者・窓口の設定状態、外部接続の説明</w:t>
+            </w:r>
+          </w:p>
+        </w:tc>
+      </w:tr>
+      <w:tr>
+        <w:trPr>
+          <w:cantSplit/>
+        </w:trPr>
+        <w:tc>
+          <w:tcPr>
+            <w:tcW w:type="dxa" w:w="2835"/>
+            <w:vAlign w:val="center"/>
+            <w:tcMar>
+              <w:top w:w="90" w:type="dxa"/>
+              <w:bottom w:w="90" w:type="dxa"/>
+              <w:left w:w="110" w:type="dxa"/>
+              <w:right w:w="110" w:type="dxa"/>
+            </w:tcMar>
+            <w:tcBorders>
+              <w:top w:val="single" w:sz="4" w:color="D9D9D9"/>
+              <w:bottom w:val="single" w:sz="4" w:color="D9D9D9"/>
+              <w:left w:val="single" w:sz="4" w:color="D9D9D9"/>
+              <w:right w:val="single" w:sz="4" w:color="D9D9D9"/>
+            </w:tcBorders>
+            <w:shd w:fill="F5F5F5"/>
+          </w:tcPr>
+          <w:p>
+            <w:r>
               <w:t>プライバシー privacy.html</w:t>
             </w:r>
           </w:p>
@@ -4362,19 +4409,8 @@
             <w:shd w:fill="F5F5F5"/>
           </w:tcPr>
           <w:p>
-            <w:pPr>
-              <w:spacing w:after="0" w:before="0" w:line="276" w:lineRule="auto"/>
-            </w:pPr>
             <w:r>
-              <w:rPr>
-                <w:sz w:val="18"/>
-              </w:rPr>
-              <w:t>登録前にも読める情報の利用目的と公開範囲</w:t>
-            </w:r>
-            <w:r>
-              <w:rPr>
-                <w:rStyle w:val="CommentReference"/>
-              </w:rPr>
+              <w:t>登録前にも読める情報の利用目的、公開範囲、保存と終了時の扱い</w:t>
             </w:r>
           </w:p>
         </w:tc>
@@ -4450,7 +4486,17 @@
     </w:p>
     <w:p>
       <w:r>
-        <w:t>詳細の基本情報はmodel.Sakeの酒種・産地・度数を使う。度数が0以下なら未確認とし、登録された参考値である旨を付記する。SakePage.pricesに容量別の税込価格があれば表示し、容量または金額が空なら未確認と表示する。pricesが空ならDBの参考価格を対象容量未確認として表示する。価格の変動や一覧との相違、購入前の公式情報確認を案内する。今回の変更ではDB値やスキーマを変更しない。</w:t>
+        <w:t>詳細の基本情報はmodel.Sakeの酒種・産地・度数を使う。度数が0以下なら未確認とし、登録された参考値である旨を付記する。SakePage.pricesに容量別の税込価格があれば表示し、容量または金額が空なら未確認と表示する。pricesが空ならDBの参考価格を対象容量未確認として表示する。価格の変動や一覧との相違、購入前の公式情報確認を案内する。</w:t>
+      </w:r>
+    </w:p>
+    <w:p>
+      <w:r>
+        <w:t>ProductImagePublicationServiceはproduct-image-publication.jsonの承認台帳を起動時に読み、銘柄ID・名称・URLの完全一致で表示可能な商品写真を判定する。approved=trueに加えて権利者、HTTPSの利用根拠URL、有効な確認日、利用条件、許可された形式の画像URLが必要で、同じ対象の重複は起動時に拒否する。公式配信ドメインやローカル保存先にあるだけでは承認しない。SakeCatalogServiceのEntityからmodel.Sakeへの変換で未承認URLをnullとし、検索・詳細・診断・ホーム比較へ同じ判定を適用する。DBの元URLは変更しない。台帳の初期7候補はすべて未承認で、写真の代替表示または省略を行う。プロフィール画像とサイト共通アイコンは商品写真台帳の対象外である。</w:t>
+      </w:r>
+    </w:p>
+    <w:p>
+      <w:r>
+        <w:t>2026年10月21日の商品情報確認では、作成SQLの獺祭 純米大吟醸45を15%へ訂正し、既存DB向けcatalog_publication_corrections.sqlに旧値・名称・産地を限定する更新を用意する。sake-pages.jsonには出羽桜 桜花吟醸の720ml・税込1771円と公式URL、八海山 特別本醸造の公式URLを反映する。商品・容量・販売時期を特定できない参考価格は変更しない。DB保存済みの詳細JSONが優先されるため、ファイル更新だけで実DBの表示が変更済みとは扱わない。10銘柄の根拠と未確認事項はcatalog-publication-audit.csv、今回の実DB適用と検証結果はPUBLICATION.mdを参照する。</w:t>
       </w:r>
     </w:p>
     <w:p>
@@ -4892,6 +4938,32 @@
       <w:pPr/>
       <w:r>
         <w:t>超過はHTTP 429、待ち時間のRetry-After、no-storeと日本語案内を返す。AuthenticationRateLimiterはIPやログインIDの原文を保持せずSHA-256で管理キーを作り、最大20000件をプロセス内メモリーに保持する。満杯時は有効な制限を追い出さず、新しい要求を待たせる。再起動で記録は消え、複数インスタンスでは共有の制限機構が必要となる。IPはrequest.getRemoteAddr()を使い、X-Forwarded-For等を直接信用しない。単一プロキシのIPに全利用者が集約される構成では正当な利用も同じ制限になるため、公開前に信頼するプロキシと利用者IPの取得方法を決めて検証する。</w:t>
+      </w:r>
+    </w:p>
+    <w:p>
+      <w:pPr>
+        <w:pStyle w:val="Heading2"/>
+      </w:pPr>
+      <w:r>
+        <w:t>5 5 公開案内と設定</w:t>
+      </w:r>
+    </w:p>
+    <w:p>
+      <w:pPr/>
+      <w:r>
+        <w:t>PublicationInformationはapp.public.operator-nameとapp.public.contact-emailを受け取り、前後の空白を除いてHomeControllerから公開案内へ渡す。SITE_OPERATOR_NAMEとSITE_CONTACT_EMAILを環境変数として指定できる。空値は許可し、運営者名は未定、窓口は準備中と表示する。設定された連絡先は形式を起動時に検証し、不正な値を拒否する。テンプレートはテキストをエスケープし、連絡先が設定済みの場合だけmailtoリンクを表示する。問い合わせ受付フォームは作らず、SMTPの送信元情報から運営者名や窓口を推定しない。</w:t>
+      </w:r>
+    </w:p>
+    <w:p>
+      <w:pPr/>
+      <w:r>
+        <w:t>about、contact、privacy、external-transmissionは認証不要の専用ページとする。Google Fontsの読み込みではブラウザからGoogleへ接続すること、認証・再設定メールはサーバーが設定済みSMTPへ宛先と本文を渡すこと、外部リンクを開く操作や承認済み外部商品写真も別の接続を伴うことを説明する。未承認の商品写真のURLはHTMLへ渡さない。</w:t>
+      </w:r>
+    </w:p>
+    <w:p>
+      <w:pPr/>
+      <w:r>
+        <w:t>卒業研究終了時にサービスを終了する方針を表示する。終了日、データ削除日、バックアップ保持期間と事前告知・処理手順は未確定で、公開前に運営者が決定する。退会は既存の本人確認付き削除処理を利用し、連動する会員データの削除とバックアップの扱いを分けて説明する。サービスの自動停止や全データの自動削除を行う機構は今回追加しない。</w:t>
       </w:r>
     </w:p>
     <w:p>
@@ -8529,15 +8601,8 @@
             <w:shd w:fill="F5F5F5"/>
           </w:tcPr>
           <w:p>
-            <w:pPr>
-              <w:keepNext/>
-              <w:spacing w:after="0" w:before="0" w:line="276" w:lineRule="auto"/>
-            </w:pPr>
             <w:r>
-              <w:rPr>
-                <w:sz w:val="18"/>
-              </w:rPr>
-              <w:t>/brewery-map、/contact、/categories、/tags</w:t>
+              <w:t>/brewery-map、/categories、/tags</w:t>
             </w:r>
           </w:p>
         </w:tc>
@@ -8627,23 +8692,8 @@
             <w:shd w:fill="FFFFFF"/>
           </w:tcPr>
           <w:p>
-            <w:pPr>
-              <w:keepNext/>
-              <w:spacing w:after="0" w:before="0" w:line="276" w:lineRule="auto"/>
-            </w:pPr>
-            <w:commentRangeStart w:id="13"/>
             <w:r>
-              <w:rPr>
-                <w:sz w:val="18"/>
-              </w:rPr>
-              <w:t>/about、/external-transmission</w:t>
-            </w:r>
-            <w:commentRangeEnd w:id="13"/>
-            <w:r>
-              <w:rPr>
-                <w:rStyle w:val="CommentReference"/>
-              </w:rPr>
-              <w:commentReference w:id="13"/>
+              <w:t>/about</w:t>
             </w:r>
           </w:p>
         </w:tc>
@@ -8666,15 +8716,8 @@
             <w:shd w:fill="FFFFFF"/>
           </w:tcPr>
           <w:p>
-            <w:pPr>
-              <w:keepNext/>
-              <w:spacing w:after="0" w:before="0" w:line="276" w:lineRule="auto"/>
-            </w:pPr>
             <w:r>
-              <w:rPr>
-                <w:sz w:val="18"/>
-              </w:rPr>
-              <w:t>公開、準備中の案内</w:t>
+              <w:t>公開、研究の目的・運営者情報・終了予定</w:t>
             </w:r>
           </w:p>
         </w:tc>
@@ -8733,26 +8776,43 @@
             <w:shd w:fill="FFFFFF"/>
           </w:tcPr>
           <w:p>
-            <w:pPr>
-              <w:keepNext w:val="0"/>
-              <w:spacing w:after="0" w:before="0" w:line="276" w:lineRule="auto"/>
-            </w:pPr>
             <w:r>
-              <w:rPr>
-                <w:sz w:val="18"/>
-              </w:rPr>
-              <w:t>/privacy</w:t>
-            </w:r>
-            <w:r>
-              <w:rPr>
-                <w:rStyle w:val="CommentReference"/>
-              </w:rPr>
+              <w:t>/contact</w:t>
             </w:r>
           </w:p>
         </w:tc>
         <w:tc>
           <w:tcPr>
             <w:tcW w:type="dxa" w:w="4195"/>
+            <w:vAlign w:val="center"/>
+            <w:tcMar>
+              <w:top w:w="90" w:type="dxa"/>
+              <w:bottom w:w="90" w:type="dxa"/>
+              <w:left w:w="110" w:type="dxa"/>
+              <w:right w:w="110" w:type="dxa"/>
+            </w:tcMar>
+            <w:tcBorders>
+              <w:top w:val="single" w:sz="4" w:color="D9D9D9"/>
+              <w:bottom w:val="single" w:sz="4" w:color="D9D9D9"/>
+              <w:left w:val="single" w:sz="4" w:color="D9D9D9"/>
+              <w:right w:val="single" w:sz="4" w:color="D9D9D9"/>
+            </w:tcBorders>
+            <w:shd w:fill="FFFFFF"/>
+          </w:tcPr>
+          <w:p>
+            <w:r>
+              <w:t>公開、窓口の設定状態と連絡方法、未設定なら準備中</w:t>
+            </w:r>
+          </w:p>
+        </w:tc>
+      </w:tr>
+      <w:tr>
+        <w:trPr>
+          <w:cantSplit/>
+        </w:trPr>
+        <w:tc>
+          <w:tcPr>
+            <w:tcW w:type="dxa" w:w="1417"/>
             <w:vAlign w:val="center"/>
             <w:tcMar>
               <w:top w:w="90" w:type="dxa"/>
@@ -8777,7 +8837,139 @@
               <w:rPr>
                 <w:sz w:val="18"/>
               </w:rPr>
-              <w:t>公開、現行機能の情報利用と公開範囲の説明</w:t>
+              <w:t>GET</w:t>
+            </w:r>
+          </w:p>
+        </w:tc>
+        <w:tc>
+          <w:tcPr>
+            <w:tcW w:type="dxa" w:w="4025"/>
+            <w:vAlign w:val="center"/>
+            <w:tcMar>
+              <w:top w:w="90" w:type="dxa"/>
+              <w:bottom w:w="90" w:type="dxa"/>
+              <w:left w:w="110" w:type="dxa"/>
+              <w:right w:w="110" w:type="dxa"/>
+            </w:tcMar>
+            <w:tcBorders>
+              <w:top w:val="single" w:sz="4" w:color="D9D9D9"/>
+              <w:bottom w:val="single" w:sz="4" w:color="D9D9D9"/>
+              <w:left w:val="single" w:sz="4" w:color="D9D9D9"/>
+              <w:right w:val="single" w:sz="4" w:color="D9D9D9"/>
+            </w:tcBorders>
+            <w:shd w:fill="FFFFFF"/>
+          </w:tcPr>
+          <w:p>
+            <w:r>
+              <w:t>/external-transmission</w:t>
+            </w:r>
+          </w:p>
+        </w:tc>
+        <w:tc>
+          <w:tcPr>
+            <w:tcW w:type="dxa" w:w="4195"/>
+            <w:vAlign w:val="center"/>
+            <w:tcMar>
+              <w:top w:w="90" w:type="dxa"/>
+              <w:bottom w:w="90" w:type="dxa"/>
+              <w:left w:w="110" w:type="dxa"/>
+              <w:right w:w="110" w:type="dxa"/>
+            </w:tcMar>
+            <w:tcBorders>
+              <w:top w:val="single" w:sz="4" w:color="D9D9D9"/>
+              <w:bottom w:val="single" w:sz="4" w:color="D9D9D9"/>
+              <w:left w:val="single" w:sz="4" w:color="D9D9D9"/>
+              <w:right w:val="single" w:sz="4" w:color="D9D9D9"/>
+            </w:tcBorders>
+            <w:shd w:fill="FFFFFF"/>
+          </w:tcPr>
+          <w:p>
+            <w:r>
+              <w:t>公開、ブラウザの外部接続とサーバーのメール送信</w:t>
+            </w:r>
+          </w:p>
+        </w:tc>
+      </w:tr>
+      <w:tr>
+        <w:trPr>
+          <w:cantSplit/>
+        </w:trPr>
+        <w:tc>
+          <w:tcPr>
+            <w:tcW w:type="dxa" w:w="1417"/>
+            <w:vAlign w:val="center"/>
+            <w:tcMar>
+              <w:top w:w="90" w:type="dxa"/>
+              <w:bottom w:w="90" w:type="dxa"/>
+              <w:left w:w="110" w:type="dxa"/>
+              <w:right w:w="110" w:type="dxa"/>
+            </w:tcMar>
+            <w:tcBorders>
+              <w:top w:val="single" w:sz="4" w:color="D9D9D9"/>
+              <w:bottom w:val="single" w:sz="4" w:color="D9D9D9"/>
+              <w:left w:val="single" w:sz="4" w:color="D9D9D9"/>
+              <w:right w:val="single" w:sz="4" w:color="D9D9D9"/>
+            </w:tcBorders>
+            <w:shd w:fill="FFFFFF"/>
+          </w:tcPr>
+          <w:p>
+            <w:pPr>
+              <w:keepNext w:val="0"/>
+              <w:spacing w:after="0" w:before="0" w:line="276" w:lineRule="auto"/>
+            </w:pPr>
+            <w:r>
+              <w:rPr>
+                <w:sz w:val="18"/>
+              </w:rPr>
+              <w:t>GET</w:t>
+            </w:r>
+          </w:p>
+        </w:tc>
+        <w:tc>
+          <w:tcPr>
+            <w:tcW w:type="dxa" w:w="4025"/>
+            <w:vAlign w:val="center"/>
+            <w:tcMar>
+              <w:top w:w="90" w:type="dxa"/>
+              <w:bottom w:w="90" w:type="dxa"/>
+              <w:left w:w="110" w:type="dxa"/>
+              <w:right w:w="110" w:type="dxa"/>
+            </w:tcMar>
+            <w:tcBorders>
+              <w:top w:val="single" w:sz="4" w:color="D9D9D9"/>
+              <w:bottom w:val="single" w:sz="4" w:color="D9D9D9"/>
+              <w:left w:val="single" w:sz="4" w:color="D9D9D9"/>
+              <w:right w:val="single" w:sz="4" w:color="D9D9D9"/>
+            </w:tcBorders>
+            <w:shd w:fill="FFFFFF"/>
+          </w:tcPr>
+          <w:p>
+            <w:r>
+              <w:t>/privacy</w:t>
+            </w:r>
+          </w:p>
+        </w:tc>
+        <w:tc>
+          <w:tcPr>
+            <w:tcW w:type="dxa" w:w="4195"/>
+            <w:vAlign w:val="center"/>
+            <w:tcMar>
+              <w:top w:w="90" w:type="dxa"/>
+              <w:bottom w:w="90" w:type="dxa"/>
+              <w:left w:w="110" w:type="dxa"/>
+              <w:right w:w="110" w:type="dxa"/>
+            </w:tcMar>
+            <w:tcBorders>
+              <w:top w:val="single" w:sz="4" w:color="D9D9D9"/>
+              <w:bottom w:val="single" w:sz="4" w:color="D9D9D9"/>
+              <w:left w:val="single" w:sz="4" w:color="D9D9D9"/>
+              <w:right w:val="single" w:sz="4" w:color="D9D9D9"/>
+            </w:tcBorders>
+            <w:shd w:fill="FFFFFF"/>
+          </w:tcPr>
+          <w:p>
+            <w:r>
+              <w:t>公開、現行機能の情報利用・公開範囲・保存と終了時の扱い</w:t>
             </w:r>
           </w:p>
         </w:tc>
@@ -8889,6 +9081,12 @@
       </w:r>
     </w:p>
     <w:p>
+      <w:pPr/>
+      <w:r>
+        <w:t>公開表示用の運営者名と問い合わせ先はSITE_OPERATOR_NAME・SITE_CONTACT_EMAILで設定する。現時点ではどちらも未定で、終了日、データ削除日、バックアップ保持期間、公開環境の提供者と委託先も公開前に確定する。商品写真は承認台帳の個別確認後に有効化する。公開内容と設定、ローカルの検証を先に進め、公開サーバーの作業はその後とする。</w:t>
+      </w:r>
+    </w:p>
+    <w:p>
       <w:pPr>
         <w:pStyle w:val="Heading2"/>
         <w:pageBreakBefore w:val="0"/>
@@ -8906,28 +9104,13 @@
       </w:r>
     </w:p>
     <w:p>
-      <w:commentRangeStart w:id="14"/>
-      <w:commentRangeStart w:id="15"/>
       <w:r>
-        <w:t>残課題は準備中ページ、プライバシーポリシーの運用情報（連絡先・保存期間・委託先）の確認、飲酒投稿・いいね・通報の操作経路、診断履歴一覧、トピック初期表示のランダム化、参考価格・度数等のデモ商品情報の精査、SMTPと公開環境の運用確認。全カタログを読む推薦・比較は現行規模向けで、件数増加時は取得件数・キャッシュ・索引を検討する。今回はこれらの未提供機能を追加したと記載しない。</w:t>
-      </w:r>
-      <w:commentRangeEnd w:id="15"/>
-      <w:r>
-        <w:rPr>
-          <w:rStyle w:val="CommentReference"/>
-        </w:rPr>
-        <w:commentReference w:id="15"/>
-      </w:r>
-      <w:commentRangeEnd w:id="14"/>
-      <w:r>
-        <w:rPr>
-          <w:rStyle w:val="CommentReference"/>
-        </w:rPr>
+        <w:t>残課題は準備中ページ、運営者と窓口・保存期間・委託先の確定、終了時の告知と処理手順、飲酒投稿・いいね・通報の操作経路、診断履歴一覧、トピック初期表示のランダム化、参考価格・度数等の商品情報と写真の掲載許諾の継続確認、SMTPと公開環境の運用確認。全カタログを読む推薦・比較は現行規模向けで、件数増加時は取得件数・キャッシュ・索引を検討する。今回はこれらの未提供機能を追加したと記載しない。今回の公開内容整備のテスト、画面確認、実DB適用の結果はPUBLICATION.mdを参照し、過去の検証と区別する。</w:t>
       </w:r>
     </w:p>
     <w:p>
       <w:r>
-        <w:t>参照資料：REQUIREMENTS.md、DB_DESIGN.md、BEGINNER_DISCOVERY.md、data/create_issho_no_deai.sql、data/SAKE_PAGES.md、docs/admin.md、docs/SECURITY.md。</w:t>
+        <w:t>参照資料：REQUIREMENTS.md、DB_DESIGN.md、BEGINNER_DISCOVERY.md、data/create_issho_no_deai.sql、data/SAKE_PAGES.md、data/SAKE_IMAGES.md、data/catalog-publication-audit.csv、docs/admin.md、docs/SECURITY.md、docs/PUBLICATION.md。</w:t>
       </w:r>
     </w:p>
     <w:sectPr>

</xml_diff>